<commit_message>
Figures 1 and 4 with five-test-set error bars; per-split results committed; draft rebuilt
</commit_message>
<xml_diff>
--- a/v3/jhss/figure_legends.docx
+++ b/v3/jhss/figure_legends.docx
@@ -32,7 +32,7 @@
           <w:i w:val="0"/>
           <w:sz w:val="20"/>
         </w:rPr>
-        <w:t xml:space="preserve"> The reliability map at Tier 3. Each row is one mismatch; the open circle is the accuracy lost by the clean-trained screen, the filled circle the loss of the randomized screen, and the black tick the irreducible part — clean accuracy minus a screen trained only at the test condition. Rows are grouped by region: modelled mismatch (blue), mismatch that helps (green) and physics the simulator omitted (orange). The clean-trained screen scores 96.47 % on clean spectra; the randomized screen 95.41 %.</w:t>
+        <w:t xml:space="preserve"> The reliability map at Tier 3. Each row is one mismatch; the open circle is the accuracy lost by the clean-trained screen, the filled circle the loss of the randomized screen, and the black tick the irreducible part — clean accuracy minus a screen trained only at the test condition. Rows are grouped by region: modelled mismatch (blue), mismatch that helps (green) and physics the simulator omitted (orange). Error bars are the standard deviation across the five test sets. The clean-trained screen scores 96.47 % on clean spectra; the randomized screen 95.41 %.</w:t>
       </w:r>
     </w:p>
     <w:p>
@@ -95,7 +95,7 @@
           <w:i w:val="0"/>
           <w:sz w:val="20"/>
         </w:rPr>
-        <w:t xml:space="preserve"> The same mismatches at the two binnings. (a) Accuracy of the clean-trained screen (bars), the randomized screen (circles) and the ceiling from a screen trained at the test condition (ticks) at Tier 3 (102 points, blue) and Tier 1 (7 points, orange). (b) The screen on the 965 known planets of Ariel's Mission Candidate Sample under the mission's own noise definition, by tier and host type.</w:t>
+        <w:t xml:space="preserve"> The same mismatches at the two binnings. (a) Accuracy of the clean-trained screen (bars), the randomized screen (circles) and the ceiling from a screen trained at the test condition (ticks) at Tier 3 (102 points, blue) and Tier 1 (7 points, orange); error bars are the standard deviation across the five test sets. (b) The screen on the 965 known planets of Ariel's Mission Candidate Sample under the mission's own noise definition, by tier and host type.</w:t>
       </w:r>
     </w:p>
     <w:sectPr>

</xml_diff>

<commit_message>
JHSS draft: third person and past tense throughout; assumptions subsection with measured effects; reference 24 DOI corrected; first screen re-implemented from its publication, second built from scratch, stated explicitly
</commit_message>
<xml_diff>
--- a/v3/jhss/figure_legends.docx
+++ b/v3/jhss/figure_legends.docx
@@ -32,7 +32,7 @@
           <w:i w:val="0"/>
           <w:sz w:val="20"/>
         </w:rPr>
-        <w:t xml:space="preserve"> The reliability map at Tier 3. Each row is one mismatch; the open circle is the accuracy lost by the clean-trained screen, the filled circle the loss of the randomized screen, and the black tick the irreducible part — clean accuracy minus a screen trained only at the test condition. Rows are grouped by region: modelled mismatch (blue), mismatch that helps (green) and physics the simulator omitted (orange). Error bars are the standard deviation across the five test sets. The clean-trained screen scores 96.47 % on clean spectra; the randomized screen 95.41 %.</w:t>
+        <w:t xml:space="preserve"> The reliability map at Tier 3. Each row is one mismatch; the open circle is the accuracy lost by the clean-trained screen, the filled circle the loss of the randomized screen, and the black tick the irreducible part — clean accuracy minus a screen trained only at the test condition. Rows are grouped by region: modelled mismatch (blue), mismatch that helps (green) and physics the simulator omitted (orange). Error bars are the standard deviation across the five test sets. The clean-trained screen scored 96.47 % on clean spectra; the randomized screen 95.41 %.</w:t>
       </w:r>
     </w:p>
     <w:p>
@@ -53,7 +53,7 @@
           <w:i w:val="0"/>
           <w:sz w:val="20"/>
         </w:rPr>
-        <w:t xml:space="preserve"> The omitted species. (a) A carbon-rich test planet at the Ariel Tier-3 binning, rendered by the training forward model (blue) and with HCN and C₂H₂ added at their equilibrium abundances (orange); the planet shown has the median effect among hot carbon-rich planets. The clean-trained screen's probability of "carbon-rich" for this planet falls from 1.00 to 0.00. (b) The same probability for all 4,508 carbon-rich test planets, clean (blue) and with the two species present (orange): the share called carbon-rich falls from 98 % to 48 %.</w:t>
+        <w:t xml:space="preserve"> The omitted species. (a) A carbon-rich test planet at the Ariel Tier-3 binning, rendered by the training forward model (blue) and with HCN and C₂H₂ added at their equilibrium abundances (orange); the planet shown had the median effect among hot carbon-rich planets. The clean-trained screen's probability of "carbon-rich" for this planet fell from 1.00 to 0.00. (b) The same probability for all 4,508 carbon-rich test planets, clean (blue) and with the two species present (orange): the share called carbon-rich fell from 98 % to 48 %.</w:t>
       </w:r>
     </w:p>
     <w:p>
@@ -74,7 +74,7 @@
           <w:i w:val="0"/>
           <w:sz w:val="20"/>
         </w:rPr>
-        <w:t xml:space="preserve"> Confidence against distance. (a) The AUROC with which the probability margin (circles) and the Mahalanobis distance (squares) rank the clean-trained screen's errors, for each mismatch; 0.5 is chance. (b) The credit of the ensemble-disagreement and k-nearest-neighbour decline rules on the randomized screen — accepted-set accuracy minus the clean selective baseline at the same coverage — for the same mismatches. The shaded columns are the two omitted-species cases, on which the ordering of the two instruments inverts.</w:t>
+        <w:t xml:space="preserve"> Confidence against distance. (a) The AUROC with which the probability margin (circles) and the Mahalanobis distance (squares) ranked the clean-trained screen's errors, for each mismatch; 0.5 is chance. (b) The credit of the ensemble-disagreement and k-nearest-neighbour decline rules on the randomized screen — accepted-set accuracy minus the clean selective baseline at the same coverage — for the same mismatches. The shaded columns are the two omitted-species cases, on which the ordering of the two instruments inverted.</w:t>
       </w:r>
     </w:p>
     <w:p>

</xml_diff>

<commit_message>
Technical note draft (JHSS): re-implementation and stress test of the consortium Tier-1 classifier, second classifier as counterexample; ariel_tier1_trust/ supplementary directory; README and project page rewritten to the current findings
</commit_message>
<xml_diff>
--- a/v3/jhss/figure_legends.docx
+++ b/v3/jhss/figure_legends.docx
@@ -32,7 +32,7 @@
           <w:i w:val="0"/>
           <w:sz w:val="20"/>
         </w:rPr>
-        <w:t xml:space="preserve"> The reliability map at Tier 3. Each row is one mismatch; the open circle is the accuracy lost by the clean-trained screen, the filled circle the loss of the randomized screen, and the black tick the irreducible part — clean accuracy minus a screen trained only at the test condition. Rows are grouped by region: modelled mismatch (blue), mismatch that helps (green) and physics the simulator omitted (orange). Error bars are the standard deviation across the five test sets. The clean-trained screen scored 96.47 % on clean spectra; the randomized screen 95.41 %.</w:t>
+        <w:t xml:space="preserve"> Accuracy of the re-implemented classifiers against the published values for the 48 combinations of classifier, molecule and abundance threshold. The dashed line marks equality and the grey band ±5 points.</w:t>
       </w:r>
     </w:p>
     <w:p>
@@ -53,7 +53,7 @@
           <w:i w:val="0"/>
           <w:sz w:val="20"/>
         </w:rPr>
-        <w:t xml:space="preserve"> The omitted species. (a) A carbon-rich test planet at the Ariel Tier-3 binning, rendered by the training forward model (blue) and with HCN and C₂H₂ added at their equilibrium abundances (orange); the planet shown had the median effect among hot carbon-rich planets. The clean-trained screen's probability of "carbon-rich" for this planet fell from 1.00 to 0.00. (b) The same probability for all 4,508 carbon-rich test planets, clean (blue) and with the two species present (orange): the share called carbon-rich fell from 98 % to 48 %.</w:t>
+        <w:t xml:space="preserve"> The re-implemented consortium classifier under each departure from its simulator (abundance threshold 10⁻⁴, mean over the four classifiers and four molecules). Open circles: accuracy lost by the classifier as published; filled circles: loss of the same design retrained on a randomized grid; black ticks: irreducible loss, what a design retrained at the test condition still lost. Error bars: standard deviation of the loss across the four molecules.</w:t>
       </w:r>
     </w:p>
     <w:p>
@@ -74,7 +74,7 @@
           <w:i w:val="0"/>
           <w:sz w:val="20"/>
         </w:rPr>
-        <w:t xml:space="preserve"> Confidence against distance. (a) The AUROC with which the probability margin (circles) and the Mahalanobis distance (squares) ranked the clean-trained screen's errors, for each mismatch; 0.5 is chance. (b) The credit of the ensemble-disagreement and k-nearest-neighbour decline rules on the randomized screen — accepted-set accuracy minus the clean selective baseline at the same coverage — for the same mismatches. The shaded columns are the two omitted-species cases, on which the ordering of the two instruments inverted.</w:t>
+        <w:t xml:space="preserve"> Why haze blinded the consortium classifier. (a) A test planet with CH₄ above 10⁻⁴ and a clear atmosphere, at the classifier's Tier-3 binning, without haze and with haze at 3 × 10⁷ m⁻³ (noise-free); the shaded region contains the three photometric points. (b) Share of planets that contain each molecule for which the classifier reported the molecule, against haze density, for the published input, the input without the three photometric points and the AIRS bins only (mean over the four classifiers and four molecules).</w:t>
       </w:r>
     </w:p>
     <w:p>
@@ -95,7 +95,7 @@
           <w:i w:val="0"/>
           <w:sz w:val="20"/>
         </w:rPr>
-        <w:t xml:space="preserve"> The same mismatches at the two binnings. (a) Accuracy of the clean-trained screen (bars), the randomized screen (circles) and the ceiling from a screen trained at the test condition (ticks) at Tier 3 (102 points, blue) and Tier 1 (7 points, orange); error bars are the standard deviation across the five test sets. (b) The screen on the 965 known planets of Ariel's Mission Candidate Sample under the mission's own noise definition, by tier and host type.</w:t>
+        <w:t xml:space="preserve"> The trust profile of the second classifier. (a) Accuracy on carbon-rich planets without and with HCN and C₂H₂ at their equilibrium abundances: on the simulated test sets at Tier-3 binning and on the 965 known Ariel targets under the payload noise model at Tier-3, Tier-2 and Tier-1 binning. The dashed line marks 50 %. (b) Accuracy lost to haze at 3 × 10⁷ m⁻³ with all inputs and with the three photometric points removed, for the consortium classifier and for the carbon-rich classifier at Tier-3 and Tier-1 binning; the clean accuracy given up by removing the points is printed above each pair.</w:t>
       </w:r>
     </w:p>
     <w:sectPr>

</xml_diff>

<commit_message>
Tighten Methods and Results: remove repetition of Table 1 in 2.1, duplicated counterexample logic, repeated deviation notes and caption qualifiers; no numbers changed
</commit_message>
<xml_diff>
--- a/v3/jhss/figure_legends.docx
+++ b/v3/jhss/figure_legends.docx
@@ -32,7 +32,7 @@
           <w:i w:val="0"/>
           <w:sz w:val="20"/>
         </w:rPr>
-        <w:t xml:space="preserve"> Accuracy of the re-implemented classifiers against the published values for the 48 combinations of classifier, molecule and abundance threshold. The dashed line marks equality and the grey band ±5 points.</w:t>
+        <w:t xml:space="preserve"> Re-implemented against published accuracy for the 48 combinations of classifier, molecule and abundance threshold. Dashed line: equality; grey band: ±5 points.</w:t>
       </w:r>
     </w:p>
     <w:p>
@@ -53,7 +53,7 @@
           <w:i w:val="0"/>
           <w:sz w:val="20"/>
         </w:rPr>
-        <w:t xml:space="preserve"> The re-implemented consortium classifier under each departure from its simulator (abundance threshold 10⁻⁴, mean over the four classifiers and four molecules). Open circles: accuracy lost by the classifier as published; filled circles: loss of the same design retrained on a randomized grid; black ticks: irreducible loss, what a design retrained at the test condition still lost. Error bars: standard deviation of the loss across the four molecules.</w:t>
+        <w:t xml:space="preserve"> The consortium classifier under each departure (threshold 10⁻⁴; mean over four classifiers and four molecules). Open circles: loss of the classifier as published; filled circles: loss after randomized training; black ticks: irreducible loss. Error bars: standard deviation across the four molecules.</w:t>
       </w:r>
     </w:p>
     <w:p>
@@ -74,7 +74,7 @@
           <w:i w:val="0"/>
           <w:sz w:val="20"/>
         </w:rPr>
-        <w:t xml:space="preserve"> Why haze blinded the consortium classifier. (a) A test planet with CH₄ above 10⁻⁴ and a clear atmosphere, at the classifier's Tier-3 binning, without haze and with haze at 3 × 10⁷ m⁻³ (noise-free); the shaded region contains the three photometric points. (b) Share of planets that contain each molecule for which the classifier reported the molecule, against haze density, for the published input, the input without the three photometric points and the AIRS bins only (mean over the four classifiers and four molecules).</w:t>
+        <w:t xml:space="preserve"> (a) A clear-atmosphere test planet with CH₄ above 10⁻⁴ at Tier-3 binning, without and with haze at 3 × 10⁷ m⁻³ (noise-free); shading marks the three photometric points. (b) Detection rate, the share of planets containing a molecule for which it was reported, against haze density for the published input, the input without the photometric points and the AIRS bins only (mean over four classifiers and four molecules).</w:t>
       </w:r>
     </w:p>
     <w:p>
@@ -95,7 +95,7 @@
           <w:i w:val="0"/>
           <w:sz w:val="20"/>
         </w:rPr>
-        <w:t xml:space="preserve"> The trust profile of the second classifier. (a) Accuracy on carbon-rich planets without and with HCN and C₂H₂ at their equilibrium abundances: on the simulated test sets at Tier-3 binning and on the 965 known Ariel targets under the payload noise model at Tier-3, Tier-2 and Tier-1 binning. The dashed line marks 50 %. (b) Accuracy lost to haze at 3 × 10⁷ m⁻³ with all inputs and with the three photometric points removed, for the consortium classifier and for the carbon-rich classifier at Tier-3 and Tier-1 binning; the clean accuracy given up by removing the points is printed above each pair.</w:t>
+        <w:t xml:space="preserve"> (a) Accuracy on carbon-rich planets without and with HCN and C₂H₂ at equilibrium abundances, on the simulated test sets (Tier 3) and on the 965 known Ariel targets with payload noise (Tiers 3, 2 and 1); dashed line, 50 %. (b) Accuracy lost to haze at 3 × 10⁷ m⁻³ with all inputs and without the three photometric points, for the consortium classifier and the carbon-rich classifier at Tier-3 and Tier-1 binning; numbers give the clean accuracy lost by removing the points.</w:t>
       </w:r>
     </w:p>
     <w:sectPr>

</xml_diff>